<commit_message>
docs: actualizar relatório final PTP3
</commit_message>
<xml_diff>
--- a/Relatorio_Final_PTP3_Projecto_Integrador.docx
+++ b/Relatorio_Final_PTP3_Projecto_Integrador.docx
@@ -2,6 +2,20 @@
 <file path=word/document.xml><?xml version="1.0" encoding="utf-8"?>
 <w:document xmlns:o="urn:schemas-microsoft-com:office:office" xmlns:r="http://schemas.openxmlformats.org/officeDocument/2006/relationships" xmlns:v="urn:schemas-microsoft-com:vml" xmlns:w="http://schemas.openxmlformats.org/wordprocessingml/2006/main" xmlns:w10="urn:schemas-microsoft-com:office:word" xmlns:wp="http://schemas.openxmlformats.org/drawingml/2006/wordprocessingDrawing" xmlns:wps="http://schemas.microsoft.com/office/word/2010/wordprocessingShape" xmlns:wpg="http://schemas.microsoft.com/office/word/2010/wordprocessingGroup" xmlns:mc="http://schemas.openxmlformats.org/markup-compatibility/2006" xmlns:wp14="http://schemas.microsoft.com/office/word/2010/wordprocessingDrawing" xmlns:w14="http://schemas.microsoft.com/office/word/2010/wordml" xmlns:w15="http://schemas.microsoft.com/office/word/2012/wordml" mc:Ignorable="w14 wp14 w15">
   <w:body>
+    <w:p>
+      <w:pPr>
+        <w:pStyle w:val="Normal"/>
+        <w:spacing w:before="0" w:after="160"/>
+        <w:jc w:val="center"/>
+        <w:rPr/>
+      </w:pPr>
+      <w:r>
+        <w:rPr/>
+      </w:r>
+      <w:r>
+        <w:br w:type="page"/>
+      </w:r>
+    </w:p>
     <w:p>
       <w:pPr>
         <w:pStyle w:val="Normal"/>
@@ -14022,7 +14036,7 @@
             <w:szCs w:val="24"/>
             <w:bCs/>
           </w:rPr>
-          <w:t>17</w:t>
+          <w:t>19</w:t>
         </w:r>
         <w:r>
           <w:rPr>
@@ -14071,7 +14085,7 @@
             <w:szCs w:val="24"/>
             <w:bCs/>
           </w:rPr>
-          <w:t>18</w:t>
+          <w:t>19</w:t>
         </w:r>
         <w:r>
           <w:rPr>
@@ -14154,7 +14168,7 @@
             <w:szCs w:val="24"/>
             <w:bCs/>
           </w:rPr>
-          <w:t>17</w:t>
+          <w:t>19</w:t>
         </w:r>
         <w:r>
           <w:rPr>
@@ -14203,7 +14217,7 @@
             <w:szCs w:val="24"/>
             <w:bCs/>
           </w:rPr>
-          <w:t>18</w:t>
+          <w:t>19</w:t>
         </w:r>
         <w:r>
           <w:rPr>
@@ -14253,7 +14267,7 @@
     <w:r>
       <w:rPr/>
       <w:drawing>
-        <wp:anchor behindDoc="1" distT="0" distB="0" distL="0" distR="0" simplePos="0" locked="0" layoutInCell="1" allowOverlap="1" relativeHeight="20">
+        <wp:anchor behindDoc="1" distT="0" distB="0" distL="0" distR="0" simplePos="0" locked="0" layoutInCell="1" allowOverlap="1" relativeHeight="21">
           <wp:simplePos x="0" y="0"/>
           <wp:positionH relativeFrom="column">
             <wp:posOffset>-914400</wp:posOffset>
@@ -14332,7 +14346,7 @@
     <w:r>
       <w:rPr/>
       <w:drawing>
-        <wp:anchor behindDoc="1" distT="0" distB="0" distL="0" distR="0" simplePos="0" locked="0" layoutInCell="1" allowOverlap="1" relativeHeight="20">
+        <wp:anchor behindDoc="1" distT="0" distB="0" distL="0" distR="0" simplePos="0" locked="0" layoutInCell="1" allowOverlap="1" relativeHeight="21">
           <wp:simplePos x="0" y="0"/>
           <wp:positionH relativeFrom="column">
             <wp:posOffset>-914400</wp:posOffset>

</xml_diff>